<commit_message>
Journal up to date.
</commit_message>
<xml_diff>
--- a/Neural network iterations process journal.docx
+++ b/Neural network iterations process journal.docx
@@ -343,6 +343,572 @@
       </w:pPr>
       <w:r>
         <w:t>Goal: make neuron interactions more realistic</w:t>
+      </w:r>
+    </w:p>
+    <w:p>
+      <w:pPr>
+        <w:pStyle w:val="NormalWeb"/>
+        <w:ind w:left="720"/>
+      </w:pPr>
+    </w:p>
+    <w:p>
+      <w:pPr>
+        <w:pStyle w:val="NormalWeb"/>
+        <w:ind w:left="720"/>
+        <w:rPr>
+          <w:lang w:val="en-US"/>
+        </w:rPr>
+      </w:pPr>
+      <w:r>
+        <w:rPr>
+          <w:rFonts w:hint="eastAsia"/>
+        </w:rPr>
+        <w:t>Conce</w:t>
+      </w:r>
+      <w:r>
+        <w:rPr>
+          <w:lang w:val="en-US"/>
+        </w:rPr>
+        <w:t xml:space="preserve">pts: </w:t>
+      </w:r>
+    </w:p>
+    <w:p>
+      <w:pPr>
+        <w:pStyle w:val="NormalWeb"/>
+        <w:numPr>
+          <w:ilvl w:val="0"/>
+          <w:numId w:val="4"/>
+        </w:numPr>
+        <w:rPr>
+          <w:lang w:val="en-US"/>
+        </w:rPr>
+      </w:pPr>
+      <w:r>
+        <w:rPr>
+          <w:lang w:val="en-US"/>
+        </w:rPr>
+        <w:t>Exponential decay: syn12 *= decay rate</w:t>
+      </w:r>
+    </w:p>
+    <w:p>
+      <w:pPr>
+        <w:pStyle w:val="NormalWeb"/>
+        <w:ind w:left="720"/>
+      </w:pPr>
+      <w:r>
+        <w:t>A spike continues influencing downstream neurons for some time after it occurs</w:t>
+      </w:r>
+      <w:r>
+        <w:t xml:space="preserve"> due to residual neurotransmitters in the synpatic cleft. </w:t>
+      </w:r>
+    </w:p>
+    <w:p>
+      <w:pPr>
+        <w:pStyle w:val="NormalWeb"/>
+        <w:numPr>
+          <w:ilvl w:val="0"/>
+          <w:numId w:val="1"/>
+        </w:numPr>
+        <w:rPr>
+          <w:lang w:val="en-US"/>
+        </w:rPr>
+      </w:pPr>
+      <w:r>
+        <w:lastRenderedPageBreak/>
+        <w:t>Three neurons with inhibition</w:t>
+      </w:r>
+    </w:p>
+    <w:p>
+      <w:pPr>
+        <w:pStyle w:val="NormalWeb"/>
+        <w:ind w:left="720"/>
+      </w:pPr>
+      <w:r>
+        <w:t>Goal: Introduce inhibitory neurons</w:t>
+      </w:r>
+    </w:p>
+    <w:p>
+      <w:pPr>
+        <w:pStyle w:val="NormalWeb"/>
+      </w:pPr>
+      <w:r>
+        <w:tab/>
+        <w:t xml:space="preserve">Concepts: </w:t>
+      </w:r>
+    </w:p>
+    <w:p>
+      <w:pPr>
+        <w:pStyle w:val="NormalWeb"/>
+        <w:numPr>
+          <w:ilvl w:val="0"/>
+          <w:numId w:val="4"/>
+        </w:numPr>
+        <w:rPr>
+          <w:lang w:val="en-US"/>
+        </w:rPr>
+      </w:pPr>
+      <w:r>
+        <w:rPr>
+          <w:lang w:val="en-US"/>
+        </w:rPr>
+        <w:t>Inhibitory connections: weight &lt;0 – decreases firing probability</w:t>
+      </w:r>
+    </w:p>
+    <w:p>
+      <w:pPr>
+        <w:pStyle w:val="NormalWeb"/>
+        <w:ind w:left="720"/>
+        <w:rPr>
+          <w:lang w:val="en-US"/>
+        </w:rPr>
+      </w:pPr>
+      <w:r>
+        <w:rPr>
+          <w:lang w:val="en-US"/>
+        </w:rPr>
+        <w:t xml:space="preserve">Without inhibition, neural networks will become unstable; it is impossible to have a network that simply grows in action potential frequency indefinitely. </w:t>
+      </w:r>
+    </w:p>
+    <w:p>
+      <w:pPr>
+        <w:pStyle w:val="NormalWeb"/>
+        <w:numPr>
+          <w:ilvl w:val="0"/>
+          <w:numId w:val="1"/>
+        </w:numPr>
+        <w:rPr>
+          <w:lang w:val="en-US"/>
+        </w:rPr>
+      </w:pPr>
+      <w:r>
+        <w:rPr>
+          <w:lang w:val="en-US"/>
+        </w:rPr>
+        <w:t>Five-neuron network using arrays</w:t>
+      </w:r>
+    </w:p>
+    <w:p>
+      <w:pPr>
+        <w:pStyle w:val="NormalWeb"/>
+        <w:ind w:left="720"/>
+        <w:rPr>
+          <w:lang w:val="en-US"/>
+        </w:rPr>
+      </w:pPr>
+      <w:r>
+        <w:rPr>
+          <w:lang w:val="en-US"/>
+        </w:rPr>
+        <w:t xml:space="preserve">Goal: switch neuron storage from variables into arrays, future networks with more neurons become scalable. </w:t>
+      </w:r>
+    </w:p>
+    <w:p>
+      <w:pPr>
+        <w:pStyle w:val="NormalWeb"/>
+        <w:ind w:left="720"/>
+        <w:rPr>
+          <w:lang w:val="en-US"/>
+        </w:rPr>
+      </w:pPr>
+      <w:r>
+        <w:rPr>
+          <w:lang w:val="en-US"/>
+        </w:rPr>
+        <w:t xml:space="preserve">Concepts: </w:t>
+      </w:r>
+    </w:p>
+    <w:p>
+      <w:pPr>
+        <w:pStyle w:val="NormalWeb"/>
+        <w:numPr>
+          <w:ilvl w:val="0"/>
+          <w:numId w:val="4"/>
+        </w:numPr>
+        <w:rPr>
+          <w:lang w:val="en-US"/>
+        </w:rPr>
+      </w:pPr>
+      <w:r>
+        <w:rPr>
+          <w:lang w:val="en-US"/>
+        </w:rPr>
+        <w:t>Arrays: v[</w:t>
+      </w:r>
+      <w:proofErr w:type="spellStart"/>
+      <w:r>
+        <w:rPr>
+          <w:lang w:val="en-US"/>
+        </w:rPr>
+        <w:t>i</w:t>
+      </w:r>
+      <w:proofErr w:type="spellEnd"/>
+      <w:r>
+        <w:rPr>
+          <w:lang w:val="en-US"/>
+        </w:rPr>
+        <w:t>]</w:t>
+      </w:r>
+    </w:p>
+    <w:p>
+      <w:pPr>
+        <w:pStyle w:val="NormalWeb"/>
+        <w:numPr>
+          <w:ilvl w:val="0"/>
+          <w:numId w:val="4"/>
+        </w:numPr>
+        <w:rPr>
+          <w:lang w:val="en-US"/>
+        </w:rPr>
+      </w:pPr>
+      <w:r>
+        <w:rPr>
+          <w:lang w:val="en-US"/>
+        </w:rPr>
+        <w:t xml:space="preserve">Weight matrix: </w:t>
+      </w:r>
+      <w:proofErr w:type="gramStart"/>
+      <w:r>
+        <w:rPr>
+          <w:lang w:val="en-US"/>
+        </w:rPr>
+        <w:t>W[</w:t>
+      </w:r>
+      <w:proofErr w:type="gramEnd"/>
+      <w:r>
+        <w:rPr>
+          <w:lang w:val="en-US"/>
+        </w:rPr>
+        <w:t>source, target] – represents all network connections</w:t>
+      </w:r>
+    </w:p>
+    <w:p>
+      <w:pPr>
+        <w:pStyle w:val="NormalWeb"/>
+        <w:ind w:left="720"/>
+        <w:rPr>
+          <w:lang w:val="en-US"/>
+        </w:rPr>
+      </w:pPr>
+      <w:r>
+        <w:rPr>
+          <w:lang w:val="en-US"/>
+        </w:rPr>
+        <w:t>The foundation of all large neural networks is to be able to store all the processing power.</w:t>
+      </w:r>
+    </w:p>
+    <w:p>
+      <w:pPr>
+        <w:pStyle w:val="NormalWeb"/>
+        <w:numPr>
+          <w:ilvl w:val="0"/>
+          <w:numId w:val="1"/>
+        </w:numPr>
+        <w:rPr>
+          <w:lang w:val="en-US"/>
+        </w:rPr>
+      </w:pPr>
+      <w:r>
+        <w:rPr>
+          <w:lang w:val="en-US"/>
+        </w:rPr>
+        <w:t>Ten-neuron network</w:t>
+      </w:r>
+    </w:p>
+    <w:p>
+      <w:pPr>
+        <w:pStyle w:val="NormalWeb"/>
+        <w:ind w:left="720"/>
+        <w:rPr>
+          <w:lang w:val="en-US"/>
+        </w:rPr>
+      </w:pPr>
+      <w:r>
+        <w:rPr>
+          <w:lang w:val="en-US"/>
+        </w:rPr>
+        <w:t xml:space="preserve">Goal: build a neural network that reacts under random constant stimuli, no real-life input yet. </w:t>
+      </w:r>
+    </w:p>
+    <w:p>
+      <w:pPr>
+        <w:pStyle w:val="NormalWeb"/>
+        <w:rPr>
+          <w:lang w:val="en-US"/>
+        </w:rPr>
+      </w:pPr>
+      <w:r>
+        <w:rPr>
+          <w:lang w:val="en-US"/>
+        </w:rPr>
+        <w:tab/>
+        <w:t xml:space="preserve">Concepts: </w:t>
+      </w:r>
+    </w:p>
+    <w:p>
+      <w:pPr>
+        <w:pStyle w:val="NormalWeb"/>
+        <w:numPr>
+          <w:ilvl w:val="0"/>
+          <w:numId w:val="5"/>
+        </w:numPr>
+        <w:rPr>
+          <w:lang w:val="en-US"/>
+        </w:rPr>
+      </w:pPr>
+      <w:r>
+        <w:rPr>
+          <w:lang w:val="en-US"/>
+        </w:rPr>
+        <w:t>Spike raster plot: neuron number vs spike time – expresses neuron action potential frequencies for large populations.</w:t>
+      </w:r>
+    </w:p>
+    <w:p>
+      <w:pPr>
+        <w:pStyle w:val="NormalWeb"/>
+        <w:numPr>
+          <w:ilvl w:val="0"/>
+          <w:numId w:val="5"/>
+        </w:numPr>
+        <w:rPr>
+          <w:lang w:val="en-US"/>
+        </w:rPr>
+      </w:pPr>
+      <w:r>
+        <w:rPr>
+          <w:lang w:val="en-US"/>
+        </w:rPr>
+        <w:t xml:space="preserve">Delayed transmission: biological signals take time to propagate along axons. Delay matrixes are used: </w:t>
+      </w:r>
+      <w:proofErr w:type="gramStart"/>
+      <w:r>
+        <w:rPr>
+          <w:lang w:val="en-US"/>
+        </w:rPr>
+        <w:t>delays[</w:t>
+      </w:r>
+      <w:proofErr w:type="gramEnd"/>
+      <w:r>
+        <w:rPr>
+          <w:lang w:val="en-US"/>
+        </w:rPr>
+        <w:t>source, target]</w:t>
+      </w:r>
+    </w:p>
+    <w:p>
+      <w:pPr>
+        <w:pStyle w:val="NormalWeb"/>
+        <w:numPr>
+          <w:ilvl w:val="0"/>
+          <w:numId w:val="5"/>
+        </w:numPr>
+        <w:rPr>
+          <w:lang w:val="en-US"/>
+        </w:rPr>
+      </w:pPr>
+      <w:r>
+        <w:rPr>
+          <w:rFonts w:hint="eastAsia"/>
+          <w:lang w:val="en-US"/>
+        </w:rPr>
+        <w:t>Hetero</w:t>
+      </w:r>
+      <w:r>
+        <w:rPr>
+          <w:lang w:val="en-US"/>
+        </w:rPr>
+        <w:t xml:space="preserve">geneous neurons: each neuron is slightly different from one another in a real brain. Neuron parameters a, b, c, d are partially randomized within a range to reduce synchronization. </w:t>
+      </w:r>
+    </w:p>
+    <w:p>
+      <w:pPr>
+        <w:pStyle w:val="NormalWeb"/>
+        <w:numPr>
+          <w:ilvl w:val="0"/>
+          <w:numId w:val="5"/>
+        </w:numPr>
+        <w:rPr>
+          <w:lang w:val="en-US"/>
+        </w:rPr>
+      </w:pPr>
+      <w:r>
+        <w:rPr>
+          <w:lang w:val="en-US"/>
+        </w:rPr>
+        <w:t xml:space="preserve">Hebbian learning: </w:t>
+      </w:r>
+      <w:r>
+        <w:rPr>
+          <w:lang w:val="en-US"/>
+        </w:rPr>
+        <w:t>neurons that fire together wire together. Weights change</w:t>
+      </w:r>
+      <w:r>
+        <w:rPr>
+          <w:rFonts w:hint="eastAsia"/>
+          <w:lang w:val="en-US"/>
+        </w:rPr>
+        <w:t xml:space="preserve"> </w:t>
+      </w:r>
+      <w:r>
+        <w:rPr>
+          <w:lang w:val="en-US"/>
+        </w:rPr>
+        <w:t>–</w:t>
+      </w:r>
+      <w:r>
+        <w:rPr>
+          <w:rFonts w:hint="eastAsia"/>
+          <w:lang w:val="en-US"/>
+        </w:rPr>
+        <w:t xml:space="preserve"> </w:t>
+      </w:r>
+      <w:r>
+        <w:rPr>
+          <w:lang w:val="en-US"/>
+        </w:rPr>
+        <w:t xml:space="preserve">synchronized firing makes connection between two neurons stronger, those that aren’t makes connection weaker. </w:t>
+      </w:r>
+    </w:p>
+    <w:p>
+      <w:pPr>
+        <w:pStyle w:val="NormalWeb"/>
+        <w:numPr>
+          <w:ilvl w:val="0"/>
+          <w:numId w:val="5"/>
+        </w:numPr>
+        <w:rPr>
+          <w:lang w:val="en-US"/>
+        </w:rPr>
+      </w:pPr>
+      <w:r>
+        <w:rPr>
+          <w:lang w:val="en-US"/>
+        </w:rPr>
+        <w:t>Learning rate: controls speed at which weights change.</w:t>
+      </w:r>
+    </w:p>
+    <w:p>
+      <w:pPr>
+        <w:pStyle w:val="NormalWeb"/>
+        <w:numPr>
+          <w:ilvl w:val="0"/>
+          <w:numId w:val="5"/>
+        </w:numPr>
+        <w:rPr>
+          <w:lang w:val="en-US"/>
+        </w:rPr>
+      </w:pPr>
+      <w:r>
+        <w:rPr>
+          <w:lang w:val="en-US"/>
+        </w:rPr>
+        <w:t xml:space="preserve">Sparse connectivity: not every neuron connects to every other neuron, connectivity is layered, from random to input -&gt; association -&gt; output -&gt; earlier layers. Structure determines function. </w:t>
+      </w:r>
+    </w:p>
+    <w:p>
+      <w:pPr>
+        <w:pStyle w:val="NormalWeb"/>
+        <w:numPr>
+          <w:ilvl w:val="0"/>
+          <w:numId w:val="5"/>
+        </w:numPr>
+        <w:rPr>
+          <w:lang w:val="en-US"/>
+        </w:rPr>
+      </w:pPr>
+      <w:r>
+        <w:rPr>
+          <w:lang w:val="en-US"/>
+        </w:rPr>
+        <w:t xml:space="preserve">Interneurons: inhibitory neurons always exist in a circuit to control activity. </w:t>
+      </w:r>
+    </w:p>
+    <w:p>
+      <w:pPr>
+        <w:pStyle w:val="NormalWeb"/>
+        <w:ind w:left="720"/>
+        <w:rPr>
+          <w:lang w:val="en-US"/>
+        </w:rPr>
+      </w:pPr>
+      <w:r>
+        <w:rPr>
+          <w:lang w:val="en-US"/>
+        </w:rPr>
+        <w:lastRenderedPageBreak/>
+        <w:t xml:space="preserve">Hebbian learning requires simultaneous spikes, yet the network I built produced delayed spikes. This is incompatible. The network had good plasticity but bad learning rule. </w:t>
+      </w:r>
+    </w:p>
+    <w:p>
+      <w:pPr>
+        <w:pStyle w:val="NormalWeb"/>
+        <w:numPr>
+          <w:ilvl w:val="0"/>
+          <w:numId w:val="1"/>
+        </w:numPr>
+        <w:rPr>
+          <w:lang w:val="en-US"/>
+        </w:rPr>
+      </w:pPr>
+      <w:r>
+        <w:rPr>
+          <w:lang w:val="en-US"/>
+        </w:rPr>
+        <w:t xml:space="preserve">Spike-Timing Dependent Plasticity (STDP): </w:t>
+      </w:r>
+    </w:p>
+    <w:p>
+      <w:pPr>
+        <w:pStyle w:val="NormalWeb"/>
+        <w:numPr>
+          <w:ilvl w:val="0"/>
+          <w:numId w:val="1"/>
+        </w:numPr>
+        <w:rPr>
+          <w:lang w:val="en-US"/>
+        </w:rPr>
+      </w:pPr>
+      <w:r>
+        <w:rPr>
+          <w:lang w:val="en-US"/>
+        </w:rPr>
+        <w:t>Larger networks</w:t>
+      </w:r>
+    </w:p>
+    <w:p>
+      <w:pPr>
+        <w:pStyle w:val="NormalWeb"/>
+        <w:numPr>
+          <w:ilvl w:val="0"/>
+          <w:numId w:val="1"/>
+        </w:numPr>
+        <w:rPr>
+          <w:lang w:val="en-US"/>
+        </w:rPr>
+      </w:pPr>
+      <w:r>
+        <w:rPr>
+          <w:lang w:val="en-US"/>
+        </w:rPr>
+        <w:t>Specialized neuron types</w:t>
+      </w:r>
+    </w:p>
+    <w:p>
+      <w:pPr>
+        <w:pStyle w:val="NormalWeb"/>
+        <w:numPr>
+          <w:ilvl w:val="0"/>
+          <w:numId w:val="1"/>
+        </w:numPr>
+        <w:rPr>
+          <w:lang w:val="en-US"/>
+        </w:rPr>
+      </w:pPr>
+      <w:r>
+        <w:rPr>
+          <w:lang w:val="en-US"/>
+        </w:rPr>
+        <w:t>Sensory processing tasks</w:t>
       </w:r>
     </w:p>
     <w:p>
@@ -489,6 +1055,119 @@
     </w:lvl>
   </w:abstractNum>
   <w:abstractNum w:abstractNumId="1" w15:restartNumberingAfterBreak="0">
+    <w:nsid w:val="1D811A70"/>
+    <w:multiLevelType w:val="hybridMultilevel"/>
+    <w:tmpl w:val="DDDE490A"/>
+    <w:lvl w:ilvl="0" w:tplc="04090001">
+      <w:start w:val="1"/>
+      <w:numFmt w:val="bullet"/>
+      <w:lvlText w:val=""/>
+      <w:lvlJc w:val="left"/>
+      <w:pPr>
+        <w:ind w:left="1440" w:hanging="360"/>
+      </w:pPr>
+      <w:rPr>
+        <w:rFonts w:ascii="Symbol" w:hAnsi="Symbol" w:hint="default"/>
+      </w:rPr>
+    </w:lvl>
+    <w:lvl w:ilvl="1" w:tplc="04090003" w:tentative="1">
+      <w:start w:val="1"/>
+      <w:numFmt w:val="bullet"/>
+      <w:lvlText w:val="o"/>
+      <w:lvlJc w:val="left"/>
+      <w:pPr>
+        <w:ind w:left="2160" w:hanging="360"/>
+      </w:pPr>
+      <w:rPr>
+        <w:rFonts w:ascii="Courier New" w:hAnsi="Courier New" w:cs="Courier New" w:hint="default"/>
+      </w:rPr>
+    </w:lvl>
+    <w:lvl w:ilvl="2" w:tplc="04090005" w:tentative="1">
+      <w:start w:val="1"/>
+      <w:numFmt w:val="bullet"/>
+      <w:lvlText w:val=""/>
+      <w:lvlJc w:val="left"/>
+      <w:pPr>
+        <w:ind w:left="2880" w:hanging="360"/>
+      </w:pPr>
+      <w:rPr>
+        <w:rFonts w:ascii="Wingdings" w:hAnsi="Wingdings" w:hint="default"/>
+      </w:rPr>
+    </w:lvl>
+    <w:lvl w:ilvl="3" w:tplc="04090001" w:tentative="1">
+      <w:start w:val="1"/>
+      <w:numFmt w:val="bullet"/>
+      <w:lvlText w:val=""/>
+      <w:lvlJc w:val="left"/>
+      <w:pPr>
+        <w:ind w:left="3600" w:hanging="360"/>
+      </w:pPr>
+      <w:rPr>
+        <w:rFonts w:ascii="Symbol" w:hAnsi="Symbol" w:hint="default"/>
+      </w:rPr>
+    </w:lvl>
+    <w:lvl w:ilvl="4" w:tplc="04090003" w:tentative="1">
+      <w:start w:val="1"/>
+      <w:numFmt w:val="bullet"/>
+      <w:lvlText w:val="o"/>
+      <w:lvlJc w:val="left"/>
+      <w:pPr>
+        <w:ind w:left="4320" w:hanging="360"/>
+      </w:pPr>
+      <w:rPr>
+        <w:rFonts w:ascii="Courier New" w:hAnsi="Courier New" w:cs="Courier New" w:hint="default"/>
+      </w:rPr>
+    </w:lvl>
+    <w:lvl w:ilvl="5" w:tplc="04090005" w:tentative="1">
+      <w:start w:val="1"/>
+      <w:numFmt w:val="bullet"/>
+      <w:lvlText w:val=""/>
+      <w:lvlJc w:val="left"/>
+      <w:pPr>
+        <w:ind w:left="5040" w:hanging="360"/>
+      </w:pPr>
+      <w:rPr>
+        <w:rFonts w:ascii="Wingdings" w:hAnsi="Wingdings" w:hint="default"/>
+      </w:rPr>
+    </w:lvl>
+    <w:lvl w:ilvl="6" w:tplc="04090001" w:tentative="1">
+      <w:start w:val="1"/>
+      <w:numFmt w:val="bullet"/>
+      <w:lvlText w:val=""/>
+      <w:lvlJc w:val="left"/>
+      <w:pPr>
+        <w:ind w:left="5760" w:hanging="360"/>
+      </w:pPr>
+      <w:rPr>
+        <w:rFonts w:ascii="Symbol" w:hAnsi="Symbol" w:hint="default"/>
+      </w:rPr>
+    </w:lvl>
+    <w:lvl w:ilvl="7" w:tplc="04090003" w:tentative="1">
+      <w:start w:val="1"/>
+      <w:numFmt w:val="bullet"/>
+      <w:lvlText w:val="o"/>
+      <w:lvlJc w:val="left"/>
+      <w:pPr>
+        <w:ind w:left="6480" w:hanging="360"/>
+      </w:pPr>
+      <w:rPr>
+        <w:rFonts w:ascii="Courier New" w:hAnsi="Courier New" w:cs="Courier New" w:hint="default"/>
+      </w:rPr>
+    </w:lvl>
+    <w:lvl w:ilvl="8" w:tplc="04090005" w:tentative="1">
+      <w:start w:val="1"/>
+      <w:numFmt w:val="bullet"/>
+      <w:lvlText w:val=""/>
+      <w:lvlJc w:val="left"/>
+      <w:pPr>
+        <w:ind w:left="7200" w:hanging="360"/>
+      </w:pPr>
+      <w:rPr>
+        <w:rFonts w:ascii="Wingdings" w:hAnsi="Wingdings" w:hint="default"/>
+      </w:rPr>
+    </w:lvl>
+  </w:abstractNum>
+  <w:abstractNum w:abstractNumId="2" w15:restartNumberingAfterBreak="0">
     <w:nsid w:val="26D02EDB"/>
     <w:multiLevelType w:val="hybridMultilevel"/>
     <w:tmpl w:val="1796243E"/>
@@ -577,7 +1256,7 @@
       </w:pPr>
     </w:lvl>
   </w:abstractNum>
-  <w:abstractNum w:abstractNumId="2" w15:restartNumberingAfterBreak="0">
+  <w:abstractNum w:abstractNumId="3" w15:restartNumberingAfterBreak="0">
     <w:nsid w:val="393B43C0"/>
     <w:multiLevelType w:val="hybridMultilevel"/>
     <w:tmpl w:val="9B382914"/>
@@ -690,14 +1369,133 @@
       </w:rPr>
     </w:lvl>
   </w:abstractNum>
+  <w:abstractNum w:abstractNumId="4" w15:restartNumberingAfterBreak="0">
+    <w:nsid w:val="52E60C29"/>
+    <w:multiLevelType w:val="hybridMultilevel"/>
+    <w:tmpl w:val="686ECDBE"/>
+    <w:lvl w:ilvl="0" w:tplc="04090001">
+      <w:start w:val="1"/>
+      <w:numFmt w:val="bullet"/>
+      <w:lvlText w:val=""/>
+      <w:lvlJc w:val="left"/>
+      <w:pPr>
+        <w:ind w:left="1440" w:hanging="360"/>
+      </w:pPr>
+      <w:rPr>
+        <w:rFonts w:ascii="Symbol" w:hAnsi="Symbol" w:hint="default"/>
+      </w:rPr>
+    </w:lvl>
+    <w:lvl w:ilvl="1" w:tplc="04090003" w:tentative="1">
+      <w:start w:val="1"/>
+      <w:numFmt w:val="bullet"/>
+      <w:lvlText w:val="o"/>
+      <w:lvlJc w:val="left"/>
+      <w:pPr>
+        <w:ind w:left="2160" w:hanging="360"/>
+      </w:pPr>
+      <w:rPr>
+        <w:rFonts w:ascii="Courier New" w:hAnsi="Courier New" w:cs="Courier New" w:hint="default"/>
+      </w:rPr>
+    </w:lvl>
+    <w:lvl w:ilvl="2" w:tplc="04090005" w:tentative="1">
+      <w:start w:val="1"/>
+      <w:numFmt w:val="bullet"/>
+      <w:lvlText w:val=""/>
+      <w:lvlJc w:val="left"/>
+      <w:pPr>
+        <w:ind w:left="2880" w:hanging="360"/>
+      </w:pPr>
+      <w:rPr>
+        <w:rFonts w:ascii="Wingdings" w:hAnsi="Wingdings" w:hint="default"/>
+      </w:rPr>
+    </w:lvl>
+    <w:lvl w:ilvl="3" w:tplc="04090001" w:tentative="1">
+      <w:start w:val="1"/>
+      <w:numFmt w:val="bullet"/>
+      <w:lvlText w:val=""/>
+      <w:lvlJc w:val="left"/>
+      <w:pPr>
+        <w:ind w:left="3600" w:hanging="360"/>
+      </w:pPr>
+      <w:rPr>
+        <w:rFonts w:ascii="Symbol" w:hAnsi="Symbol" w:hint="default"/>
+      </w:rPr>
+    </w:lvl>
+    <w:lvl w:ilvl="4" w:tplc="04090003" w:tentative="1">
+      <w:start w:val="1"/>
+      <w:numFmt w:val="bullet"/>
+      <w:lvlText w:val="o"/>
+      <w:lvlJc w:val="left"/>
+      <w:pPr>
+        <w:ind w:left="4320" w:hanging="360"/>
+      </w:pPr>
+      <w:rPr>
+        <w:rFonts w:ascii="Courier New" w:hAnsi="Courier New" w:cs="Courier New" w:hint="default"/>
+      </w:rPr>
+    </w:lvl>
+    <w:lvl w:ilvl="5" w:tplc="04090005" w:tentative="1">
+      <w:start w:val="1"/>
+      <w:numFmt w:val="bullet"/>
+      <w:lvlText w:val=""/>
+      <w:lvlJc w:val="left"/>
+      <w:pPr>
+        <w:ind w:left="5040" w:hanging="360"/>
+      </w:pPr>
+      <w:rPr>
+        <w:rFonts w:ascii="Wingdings" w:hAnsi="Wingdings" w:hint="default"/>
+      </w:rPr>
+    </w:lvl>
+    <w:lvl w:ilvl="6" w:tplc="04090001" w:tentative="1">
+      <w:start w:val="1"/>
+      <w:numFmt w:val="bullet"/>
+      <w:lvlText w:val=""/>
+      <w:lvlJc w:val="left"/>
+      <w:pPr>
+        <w:ind w:left="5760" w:hanging="360"/>
+      </w:pPr>
+      <w:rPr>
+        <w:rFonts w:ascii="Symbol" w:hAnsi="Symbol" w:hint="default"/>
+      </w:rPr>
+    </w:lvl>
+    <w:lvl w:ilvl="7" w:tplc="04090003" w:tentative="1">
+      <w:start w:val="1"/>
+      <w:numFmt w:val="bullet"/>
+      <w:lvlText w:val="o"/>
+      <w:lvlJc w:val="left"/>
+      <w:pPr>
+        <w:ind w:left="6480" w:hanging="360"/>
+      </w:pPr>
+      <w:rPr>
+        <w:rFonts w:ascii="Courier New" w:hAnsi="Courier New" w:cs="Courier New" w:hint="default"/>
+      </w:rPr>
+    </w:lvl>
+    <w:lvl w:ilvl="8" w:tplc="04090005" w:tentative="1">
+      <w:start w:val="1"/>
+      <w:numFmt w:val="bullet"/>
+      <w:lvlText w:val=""/>
+      <w:lvlJc w:val="left"/>
+      <w:pPr>
+        <w:ind w:left="7200" w:hanging="360"/>
+      </w:pPr>
+      <w:rPr>
+        <w:rFonts w:ascii="Wingdings" w:hAnsi="Wingdings" w:hint="default"/>
+      </w:rPr>
+    </w:lvl>
+  </w:abstractNum>
   <w:num w:numId="1" w16cid:durableId="2025130568">
-    <w:abstractNumId w:val="1"/>
+    <w:abstractNumId w:val="2"/>
   </w:num>
   <w:num w:numId="2" w16cid:durableId="1729761161">
-    <w:abstractNumId w:val="2"/>
+    <w:abstractNumId w:val="3"/>
   </w:num>
   <w:num w:numId="3" w16cid:durableId="1991447119">
     <w:abstractNumId w:val="0"/>
+  </w:num>
+  <w:num w:numId="4" w16cid:durableId="1305044797">
+    <w:abstractNumId w:val="4"/>
+  </w:num>
+  <w:num w:numId="5" w16cid:durableId="347605046">
+    <w:abstractNumId w:val="1"/>
   </w:num>
 </w:numbering>
 </file>

</xml_diff>